<commit_message>
Add FAQ, InfoQ conference deck, and recommended publication titles.
Refresh the 20-slide presentation and showcase docs with article, talk, and technical titles for InfoQ submission.

Co-authored-by: Cursor <cursoragent@cursor.com>
</commit_message>
<xml_diff>
--- a/docs/EDTA_COMPLETE_SHOWCASE_updated.docx
+++ b/docs/EDTA_COMPLETE_SHOWCASE_updated.docx
@@ -4907,15 +4907,49 @@
         <w:pStyle w:val="Heading2"/>
       </w:pPr>
       <w:r>
-        <w:t>Suggested working title for publication:</w:t>
+        <w:t>Suggested titles for publication and talks:</w:t>
       </w:r>
     </w:p>
     <w:p>
       <w:pPr>
-        <w:pStyle w:val="DocSubtitle"/>
+        <w:pStyle w:val="ListBullet"/>
       </w:pPr>
       <w:r>
-        <w:t>Governed Personalization: A Four-Tier Architecture for Explainable, Trust-Aware Recommendations</w:t>
+        <w:rPr>
+          <w:b/>
+        </w:rPr>
+        <w:t xml:space="preserve">InfoQ article: </w:t>
+      </w:r>
+      <w:r>
+        <w:t>Governed Personalization: Why Trust Must Change the Rank, Not Just the Log</w:t>
+      </w:r>
+    </w:p>
+    <w:p>
+      <w:pPr>
+        <w:pStyle w:val="ListBullet"/>
+      </w:pPr>
+      <w:r>
+        <w:rPr>
+          <w:b/>
+        </w:rPr>
+        <w:t xml:space="preserve">Conference talk: </w:t>
+      </w:r>
+      <w:r>
+        <w:t>Why Did We Show This? Designing Auditable Recommendation Systems</w:t>
+      </w:r>
+    </w:p>
+    <w:p>
+      <w:pPr>
+        <w:pStyle w:val="ListBullet"/>
+      </w:pPr>
+      <w:r>
+        <w:rPr>
+          <w:b/>
+        </w:rPr>
+        <w:t xml:space="preserve">Technical / GitHub: </w:t>
+      </w:r>
+      <w:r>
+        <w:t>Beyond LLM-First Recommendations: A Four-Tier Architecture for Trust-Aware Ranking</w:t>
       </w:r>
     </w:p>
     <w:p>

</xml_diff>